<commit_message>
Update readme and report.txt
</commit_message>
<xml_diff>
--- a/reports/figures/REAL ESTATE INSIGHTS REPORT.docx
+++ b/reports/figures/REAL ESTATE INSIGHTS REPORT.docx
@@ -70,10 +70,7 @@
     </w:p>
     <w:p>
       <w:r>
-        <w:t>Below are insights generated from</w:t>
-      </w:r>
-      <w:r>
-        <w:t xml:space="preserve"> meqasa:</w:t>
+        <w:t>Below are insights generated from meqasa:</w:t>
       </w:r>
     </w:p>
     <w:p>
@@ -109,7 +106,13 @@
         <w:t>₵</w:t>
       </w:r>
       <w:r>
-        <w:t xml:space="preserve"> 28,033.08 per month.</w:t>
+        <w:t xml:space="preserve"> 28,0</w:t>
+      </w:r>
+      <w:r>
+        <w:t xml:space="preserve">98 </w:t>
+      </w:r>
+      <w:r>
+        <w:t>per month.</w:t>
       </w:r>
     </w:p>
     <w:p>
@@ -127,7 +130,13 @@
         <w:t>₵</w:t>
       </w:r>
       <w:r>
-        <w:t xml:space="preserve"> 22,500 a month.</w:t>
+        <w:t xml:space="preserve"> 22,</w:t>
+      </w:r>
+      <w:r>
+        <w:t>8</w:t>
+      </w:r>
+      <w:r>
+        <w:t>00 a month.</w:t>
       </w:r>
     </w:p>
     <w:p>
@@ -163,82 +172,31 @@
         </w:numPr>
       </w:pPr>
       <w:r>
-        <w:t xml:space="preserve">The top five locations with the most expensive rent </w:t>
-      </w:r>
-      <w:r>
-        <w:t>are.</w:t>
-      </w:r>
-      <w:r>
-        <w:t xml:space="preserve"> </w:t>
-      </w:r>
-    </w:p>
-    <w:p>
-      <w:pPr>
-        <w:pStyle w:val="ListParagraph"/>
-        <w:numPr>
-          <w:ilvl w:val="0"/>
-          <w:numId w:val="2"/>
-        </w:numPr>
-      </w:pPr>
-      <w:r>
-        <w:t>Airport residential area</w:t>
-      </w:r>
-    </w:p>
-    <w:p>
-      <w:pPr>
-        <w:pStyle w:val="ListParagraph"/>
-        <w:numPr>
-          <w:ilvl w:val="0"/>
-          <w:numId w:val="2"/>
-        </w:numPr>
-      </w:pPr>
-      <w:r>
-        <w:t>Labone</w:t>
-      </w:r>
-    </w:p>
-    <w:p>
-      <w:pPr>
-        <w:pStyle w:val="ListParagraph"/>
-        <w:numPr>
-          <w:ilvl w:val="0"/>
-          <w:numId w:val="2"/>
-        </w:numPr>
-      </w:pPr>
-      <w:r>
-        <w:t xml:space="preserve">Spintex community </w:t>
-      </w:r>
-      <w:r>
-        <w:t>eighteen</w:t>
-      </w:r>
-      <w:r>
-        <w:t xml:space="preserve"> </w:t>
-      </w:r>
-      <w:r>
-        <w:t>roundabouts</w:t>
-      </w:r>
-    </w:p>
-    <w:p>
-      <w:pPr>
-        <w:pStyle w:val="ListParagraph"/>
-        <w:numPr>
-          <w:ilvl w:val="0"/>
-          <w:numId w:val="2"/>
-        </w:numPr>
-      </w:pPr>
-      <w:r>
-        <w:t>Airport</w:t>
-      </w:r>
-    </w:p>
-    <w:p>
-      <w:pPr>
-        <w:pStyle w:val="ListParagraph"/>
-        <w:numPr>
-          <w:ilvl w:val="0"/>
-          <w:numId w:val="2"/>
-        </w:numPr>
-      </w:pPr>
-      <w:r>
-        <w:t>Tse Addo</w:t>
+        <w:t xml:space="preserve">The percentage of homes that were </w:t>
+      </w:r>
+      <w:r>
+        <w:t>furnished was</w:t>
+      </w:r>
+      <w:r>
+        <w:t xml:space="preserve"> 36.</w:t>
+      </w:r>
+      <w:r>
+        <w:t>86</w:t>
+      </w:r>
+      <w:r>
+        <w:t xml:space="preserve">% and those that were unfurnished </w:t>
+      </w:r>
+      <w:r>
+        <w:t>were</w:t>
+      </w:r>
+      <w:r>
+        <w:t xml:space="preserve"> 63.</w:t>
+      </w:r>
+      <w:r>
+        <w:t>14</w:t>
+      </w:r>
+      <w:r>
+        <w:t>%.</w:t>
       </w:r>
     </w:p>
     <w:p>
@@ -250,19 +208,55 @@
         </w:numPr>
       </w:pPr>
       <w:r>
-        <w:t xml:space="preserve">The percentage of homes that were </w:t>
-      </w:r>
-      <w:r>
-        <w:t>furnished was</w:t>
-      </w:r>
-      <w:r>
-        <w:t xml:space="preserve"> 36.74% and those that were either unfurnished or not specified if furnished or not </w:t>
-      </w:r>
-      <w:r>
-        <w:t>were</w:t>
-      </w:r>
-      <w:r>
-        <w:t xml:space="preserve"> 63.26%.</w:t>
+        <w:t xml:space="preserve"> As expected, the higher the number of bedrooms, the higher the rent but that was not the case </w:t>
+      </w:r>
+      <w:r>
+        <w:t>with</w:t>
+      </w:r>
+      <w:r>
+        <w:t xml:space="preserve"> th</w:t>
+      </w:r>
+      <w:r>
+        <w:t>e</w:t>
+      </w:r>
+      <w:r>
+        <w:t xml:space="preserve"> insights</w:t>
+      </w:r>
+      <w:r>
+        <w:t xml:space="preserve"> generated</w:t>
+      </w:r>
+      <w:r>
+        <w:t xml:space="preserve">. A </w:t>
+      </w:r>
+      <w:r>
+        <w:t>21-bedroom</w:t>
+      </w:r>
+      <w:r>
+        <w:t xml:space="preserve"> house </w:t>
+      </w:r>
+      <w:r>
+        <w:t>costs</w:t>
+      </w:r>
+      <w:r>
+        <w:t xml:space="preserve"> le</w:t>
+      </w:r>
+      <w:r>
+        <w:t xml:space="preserve">ss </w:t>
+      </w:r>
+      <w:r>
+        <w:t xml:space="preserve">in average rent per bedroom. This is because the listing for the </w:t>
+      </w:r>
+      <w:r>
+        <w:t>twenty-one</w:t>
+      </w:r>
+      <w:r>
+        <w:t xml:space="preserve"> bedroom was one but many for other types of bedroom houses</w:t>
+      </w:r>
+      <w:r>
+        <w:t xml:space="preserve"> or apartments. A 12-bedroom apartment costs less than a 4- and 6-bedroom house. This may be due to the location of these listings as location plays a key role in the price.</w:t>
+      </w:r>
+      <w:r>
+        <w:t xml:space="preserve"> Also meqasa listings has most of its properties from affluent neighborhoods hence the outrageous monthly rent.</w:t>
       </w:r>
     </w:p>
     <w:p>
@@ -274,68 +268,47 @@
         </w:numPr>
       </w:pPr>
       <w:r>
-        <w:t xml:space="preserve"> As expected, the higher the number of bedrooms, the higher the rent but that was not the case </w:t>
-      </w:r>
-      <w:r>
-        <w:t>with</w:t>
-      </w:r>
-      <w:r>
-        <w:t xml:space="preserve"> th</w:t>
-      </w:r>
-      <w:r>
-        <w:t>e</w:t>
-      </w:r>
-      <w:r>
-        <w:t xml:space="preserve"> insights</w:t>
-      </w:r>
-      <w:r>
-        <w:t xml:space="preserve"> generated</w:t>
-      </w:r>
-      <w:r>
-        <w:t xml:space="preserve">. A </w:t>
-      </w:r>
-      <w:r>
-        <w:t>21-bedroom</w:t>
-      </w:r>
-      <w:r>
-        <w:t xml:space="preserve"> house </w:t>
-      </w:r>
-      <w:r>
-        <w:t>costs</w:t>
-      </w:r>
-      <w:r>
-        <w:t xml:space="preserve"> le</w:t>
-      </w:r>
-      <w:r>
-        <w:t xml:space="preserve">ss </w:t>
-      </w:r>
-      <w:r>
-        <w:t xml:space="preserve">in average rent per bedroom. This is because the listing for the </w:t>
-      </w:r>
-      <w:r>
-        <w:t>twenty-one</w:t>
-      </w:r>
-      <w:r>
-        <w:t xml:space="preserve"> bedroom was one but many for other types of bedroom houses</w:t>
-      </w:r>
-      <w:r>
-        <w:t xml:space="preserve"> or apartments. A 12-bedroom apartment costs less than a 4- and 6-bedroom house. This may be due to the location of these listings as location plays a key role in the price.</w:t>
+        <w:t>Homes that had comfort features lead with 28.49 percent. Followed by utility features</w:t>
+      </w:r>
+      <w:r>
+        <w:t xml:space="preserve"> </w:t>
+      </w:r>
+      <w:r>
+        <w:t>(26.96%),</w:t>
+      </w:r>
+      <w:r>
+        <w:t xml:space="preserve"> luxury features (19.56%), connectivity features (16.01%) and extra space (8.98%). </w:t>
+      </w:r>
+      <w:r>
+        <w:t xml:space="preserve"> </w:t>
       </w:r>
     </w:p>
     <w:p>
       <w:pPr>
         <w:pStyle w:val="ListParagraph"/>
       </w:pPr>
+    </w:p>
+    <w:p>
+      <w:pPr>
+        <w:pStyle w:val="ListParagraph"/>
+      </w:pPr>
+    </w:p>
+    <w:p/>
+    <w:p/>
+    <w:p/>
+    <w:p/>
+    <w:p/>
+    <w:p>
       <w:r>
         <w:rPr>
           <w:noProof/>
         </w:rPr>
         <w:lastRenderedPageBreak/>
         <w:drawing>
-          <wp:inline distT="0" distB="0" distL="0" distR="0" wp14:anchorId="73FCB74C" wp14:editId="5932113A">
-            <wp:extent cx="5943600" cy="3485982"/>
-            <wp:effectExtent l="0" t="0" r="0" b="635"/>
-            <wp:docPr id="427688806" name="Picture 1"/>
+          <wp:inline distT="0" distB="0" distL="0" distR="0" wp14:anchorId="0A297E8D" wp14:editId="640C6179">
+            <wp:extent cx="5943600" cy="3340735"/>
+            <wp:effectExtent l="0" t="0" r="0" b="0"/>
+            <wp:docPr id="954220096" name="Picture 1" descr="A screenshot of a computer&#10;&#10;AI-generated content may be incorrect."/>
             <wp:cNvGraphicFramePr>
               <a:graphicFrameLocks xmlns:a="http://schemas.openxmlformats.org/drawingml/2006/main" noChangeAspect="1"/>
             </wp:cNvGraphicFramePr>
@@ -343,7 +316,7 @@
               <a:graphicData uri="http://schemas.openxmlformats.org/drawingml/2006/picture">
                 <pic:pic xmlns:pic="http://schemas.openxmlformats.org/drawingml/2006/picture">
                   <pic:nvPicPr>
-                    <pic:cNvPr id="427688806" name="Picture 427688806"/>
+                    <pic:cNvPr id="954220096" name="Picture 1" descr="A screenshot of a computer&#10;&#10;AI-generated content may be incorrect."/>
                     <pic:cNvPicPr/>
                   </pic:nvPicPr>
                   <pic:blipFill>
@@ -361,7 +334,7 @@
                   <pic:spPr>
                     <a:xfrm>
                       <a:off x="0" y="0"/>
-                      <a:ext cx="5943600" cy="3485982"/>
+                      <a:ext cx="5943600" cy="3340735"/>
                     </a:xfrm>
                     <a:prstGeom prst="rect">
                       <a:avLst/>
@@ -374,17 +347,6 @@
         </w:drawing>
       </w:r>
     </w:p>
-    <w:p>
-      <w:pPr>
-        <w:pStyle w:val="ListParagraph"/>
-      </w:pPr>
-    </w:p>
-    <w:p/>
-    <w:p/>
-    <w:p/>
-    <w:p/>
-    <w:p/>
-    <w:p/>
     <w:sectPr>
       <w:pgSz w:w="12240" w:h="15840"/>
       <w:pgMar w:top="1440" w:right="1440" w:bottom="1440" w:left="1440" w:header="720" w:footer="720" w:gutter="0"/>
@@ -1389,6 +1351,7 @@
   <w:style w:type="character" w:default="1" w:styleId="DefaultParagraphFont">
     <w:name w:val="Default Paragraph Font"/>
     <w:uiPriority w:val="1"/>
+    <w:semiHidden/>
     <w:unhideWhenUsed/>
   </w:style>
   <w:style w:type="table" w:default="1" w:styleId="TableNormal">

</xml_diff>